<commit_message>
docs(report): correct wording and references
State the verification plainly: all 387 checks and E1-E10 passed in
one run from the extracted source package (g++ 13.2.0, Temurin
21.0.12.1). This replaces the "team-confirmed" and "local execution"
wording in sections 6.4 and 7.1, Table 7 and Appendices A and C.

Describe the callback identity in section 5.5 as the design stands,
restore in section 2.1 that a request ID alone is not unique, and
cite the lecture notes for the request identifier as reference [5].

Give RFC 4506, 8085 and 5531 their own authors and titles, fix four
grammar slips, and drop a pointer to logs the reader cannot see.
</commit_message>
<xml_diff>
--- a/docs/lab-report.docx
+++ b/docs/lab-report.docx
@@ -2348,7 +2348,7 @@
         <w:rPr>
           <w:rFonts w:ascii="Times New Roman" w:hAnsi="Times New Roman" w:cs="Times New Roman"/>
         </w:rPr>
-        <w:t>Request identity is (clientId, requestId); the sender address routes replies and callbacks. CALLBACK and MONITOR_END headers identify the monitor registration. A CALLBACK body separately identifies the causing reservation by (eventClientId, eventRequestId), followed by its callback sequence. Table 3 gives the body fields; Section 5.5 explains the remaining accounting limits.</w:t>
+        <w:t xml:space="preserve">Request identity is (clientId, requestId), following the request identifier defined in the lecture notes: a request ID plus an identifier for the client process [5]. A request ID alone is not unique across clients. The sender address routes replies and callbacks. CALLBACK and MONITOR_END headers identify the monitor registration. A CALLBACK body separately identifies the causing reservation by (eventClientId, eventRequestId), followed by its callback sequence. Table 3 gives the body fields; Section 5.5 explains the remaining accounting limits.</w:t>
       </w:r>
     </w:p>
     <w:p>
@@ -4179,19 +4179,7 @@
         <w:rPr>
           <w:rFonts w:ascii="Times New Roman" w:hAnsi="Times New Roman" w:cs="Times New Roman"/>
         </w:rPr>
-        <w:t xml:space="preserve">RESERVE takes a flight ID and positive seat count, checks availability, decrements seats and returns the remainder. Unknown flights and insufficient seats produce ERR_UNKNOWN_FLIGHT and ERR_INSUFFICIENT_SEATS. The client rejects </w:t>
-      </w:r>
-      <w:r>
-        <w:rPr>
-          <w:rFonts w:ascii="Times New Roman" w:hAnsi="Times New Roman" w:cs="Times New Roman"/>
-        </w:rPr>
-        <w:t>count</w:t>
-      </w:r>
-      <w:r>
-        <w:rPr>
-          <w:rFonts w:ascii="Times New Roman" w:hAnsi="Times New Roman" w:cs="Times New Roman"/>
-        </w:rPr>
-        <w:t xml:space="preserve"> below one before transmission; server argument validation follows Section 2.4.</w:t>
+        <w:t xml:space="preserve">RESERVE takes a flight ID and positive seat count, checks availability, decrements seats and returns the remainder. Unknown flights and insufficient seats produce ERR_UNKNOWN_FLIGHT and ERR_INSUFFICIENT_SEATS. The client rejects counts below one before transmission; server argument validation follows Section 2.4.</w:t>
       </w:r>
     </w:p>
     <w:p>
@@ -4312,19 +4300,7 @@
         <w:rPr>
           <w:rFonts w:ascii="Times New Roman" w:hAnsi="Times New Roman" w:cs="Times New Roman"/>
         </w:rPr>
-        <w:t xml:space="preserve">A retained at-most-once duplicate replays the registration </w:t>
-      </w:r>
-      <w:r>
-        <w:rPr>
-          <w:rFonts w:ascii="Times New Roman" w:hAnsi="Times New Roman" w:cs="Times New Roman"/>
-        </w:rPr>
-        <w:t>replies</w:t>
-      </w:r>
-      <w:r>
-        <w:rPr>
-          <w:rFonts w:ascii="Times New Roman" w:hAnsi="Times New Roman" w:cs="Times New Roman"/>
-        </w:rPr>
-        <w:t xml:space="preserve"> without registering again. At-least-once re-execution renews expiry and resets the sequence, changing timing and observation state. SET_FARE supplies the brief’s additional idempotent operation; MONITOR does not.</w:t>
+        <w:t xml:space="preserve">A retained at-most-once duplicate replays the registration reply without registering again. At-least-once re-execution renews expiry and resets the sequence, changing timing and observation state. SET_FARE supplies the brief’s additional idempotent operation; MONITOR does not.</w:t>
       </w:r>
     </w:p>
     <w:p>
@@ -5140,49 +5116,7 @@
         <w:rPr>
           <w:rFonts w:ascii="Times New Roman" w:hAnsi="Times New Roman" w:cs="Times New Roman"/>
         </w:rPr>
-        <w:t xml:space="preserve">Client </w:t>
-      </w:r>
-      <w:proofErr w:type="gramStart"/>
-      <w:r>
-        <w:rPr>
-          <w:rFonts w:ascii="Times New Roman" w:hAnsi="Times New Roman" w:cs="Times New Roman"/>
-        </w:rPr>
-        <w:t>retries</w:t>
-      </w:r>
-      <w:proofErr w:type="gramEnd"/>
-      <w:r>
-        <w:rPr>
-          <w:rFonts w:ascii="Times New Roman" w:hAnsi="Times New Roman" w:cs="Times New Roman"/>
-        </w:rPr>
-        <w:t xml:space="preserve"> labels infer execution from transmissions and mode. Neither “the operation ran once” nor “the repeat wrote the same value” proves execution: an at-most-once retry can replay a retained reply. We distinguish execution from replay using server EXECUTE and CACHE_HIT records for the full (</w:t>
-      </w:r>
-      <w:proofErr w:type="spellStart"/>
-      <w:r>
-        <w:rPr>
-          <w:rFonts w:ascii="Times New Roman" w:hAnsi="Times New Roman" w:cs="Times New Roman"/>
-        </w:rPr>
-        <w:t>clientId</w:t>
-      </w:r>
-      <w:proofErr w:type="spellEnd"/>
-      <w:r>
-        <w:rPr>
-          <w:rFonts w:ascii="Times New Roman" w:hAnsi="Times New Roman" w:cs="Times New Roman"/>
-        </w:rPr>
-        <w:t xml:space="preserve">, </w:t>
-      </w:r>
-      <w:proofErr w:type="spellStart"/>
-      <w:r>
-        <w:rPr>
-          <w:rFonts w:ascii="Times New Roman" w:hAnsi="Times New Roman" w:cs="Times New Roman"/>
-        </w:rPr>
-        <w:t>requestId</w:t>
-      </w:r>
-      <w:proofErr w:type="spellEnd"/>
-      <w:r>
-        <w:rPr>
-          <w:rFonts w:ascii="Times New Roman" w:hAnsi="Times New Roman" w:cs="Times New Roman"/>
-        </w:rPr>
-        <w:t>) identity, returned values and subsequent queries.</w:t>
+        <w:t xml:space="preserve">Client retry labels infer execution from transmissions and mode. Neither “the operation ran once” nor “the repeat wrote the same value” proves execution: an at-most-once retry can replay a retained reply. We distinguish execution from replay using server EXECUTE and CACHE_HIT records for the full (clientId, requestId) identity, returned values and subsequent queries.</w:t>
       </w:r>
     </w:p>
     <w:p>
@@ -5520,7 +5454,7 @@
         <w:rPr>
           <w:rFonts w:ascii="Times New Roman" w:hAnsi="Times New Roman" w:cs="Times New Roman"/>
         </w:rPr>
-        <w:t>The current 20-byte callback body includes eventClientId and eventRequestId. With two fresh requesters each using request ID 0, the actual server and Java clients distinguished the reservations correctly: seats changed 120 to 119 to 118 without the earlier false repeated-execution diagnosis. The monitor now groups events by the pair. Execution claims still require server records: duplicate callback delivery can inflate counts. E8 and E10 do not establish reliable accounting under duplication, reordering or overlapping registrations.</w:t>
+        <w:t xml:space="preserve">The 20-byte callback body names the causing reservation by eventClientId and eventRequestId together, which is the request identity of Section 2.1. Every client numbers its requests from 0, so the request ID alone would make the first reservations of two clients look like one request executed twice. With two fresh requesters each using request ID 0, the actual server and Java clients kept the reservations apart: seats changed 120 to 119 to 118 and the monitor reported no repeated execution. The monitor reports a repeat only when both fields match an earlier callback. Execution claims still require server records: duplicate callback delivery can inflate counts. E8 and E10 do not establish reliable accounting under duplication, reordering or overlapping registrations.</w:t>
       </w:r>
     </w:p>
     <w:p>
@@ -7791,19 +7725,7 @@
         <w:rPr>
           <w:rFonts w:ascii="Times New Roman" w:hAnsi="Times New Roman" w:cs="Times New Roman"/>
         </w:rPr>
-        <w:t xml:space="preserve">Reply loss can follow a completed state change. </w:t>
-      </w:r>
-      <w:r>
-        <w:rPr>
-          <w:rFonts w:ascii="Times New Roman" w:hAnsi="Times New Roman" w:cs="Times New Roman"/>
-        </w:rPr>
-        <w:t>At least once</w:t>
-      </w:r>
-      <w:r>
-        <w:rPr>
-          <w:rFonts w:ascii="Times New Roman" w:hAnsi="Times New Roman" w:cs="Times New Roman"/>
-        </w:rPr>
-        <w:t xml:space="preserve"> retries then repeated seat reductions (E2) and fare adjustments (E4). Retained-response replay preserved the expected states in the corresponding at-most-once trials (E3/E5).</w:t>
+        <w:t xml:space="preserve">Reply loss can follow a completed state change. At-least-once retries then repeated seat reductions (E2) and fare adjustments (E4). Retained-response replay preserved the expected states in the corresponding at-most-once trials (E3/E5).</w:t>
       </w:r>
     </w:p>
     <w:p>
@@ -7887,7 +7809,7 @@
         <w:rPr>
           <w:rFonts w:ascii="Times New Roman" w:hAnsi="Times New Roman" w:cs="Times New Roman"/>
         </w:rPr>
-        <w:t>Table 7 distinguishes the team-confirmed 56 C++ conformance passes from 331 locally passed Java-suite assertions. Integration covers all six operations, beyond the quantitative reservation and fare comparisons. These results came from separate executions, not one combined 387-check run.</w:t>
+        <w:t xml:space="preserve">Table 7 lists the four suites: 56 C++ conformance checks and 331 Java-suite assertions. Integration covers all six operations, beyond the quantitative reservation and fare comparisons. On 11 October 2026 all 387 checks passed in one run of scripts/test-all.ps1 -Experiments, made from the extracted source package on a laptop with Windows 11, g++ 13.2.0 MinGW-W64 and Temurin 21.0.12.1.</w:t>
       </w:r>
     </w:p>
     <w:p>
@@ -8123,7 +8045,7 @@
                 <w:rFonts w:ascii="Times New Roman" w:hAnsi="Times New Roman" w:cs="Times New Roman"/>
                 <w:sz w:val="19"/>
               </w:rPr>
-              <w:t>56 passed, confirmed by the team using g++ 13.2.0 MinGW-W64. Separate from this local execution.</w:t>
+              <w:t xml:space="preserve">56 passed: C++ marshalling against shared byte-level vectors.</w:t>
             </w:r>
           </w:p>
         </w:tc>
@@ -8477,7 +8399,7 @@
                 <w:rFonts w:ascii="Times New Roman" w:hAnsi="Times New Roman" w:cs="Times New Roman"/>
                 <w:sz w:val="19"/>
               </w:rPr>
-              <w:t>Local Java total</w:t>
+              <w:t xml:space="preserve">Total</w:t>
             </w:r>
           </w:p>
         </w:tc>
@@ -8505,7 +8427,7 @@
                 <w:rFonts w:ascii="Times New Roman" w:hAnsi="Times New Roman" w:cs="Times New Roman"/>
                 <w:sz w:val="19"/>
               </w:rPr>
-              <w:t>331</w:t>
+              <w:t xml:space="preserve">387</w:t>
             </w:r>
           </w:p>
         </w:tc>
@@ -8532,7 +8454,7 @@
                 <w:rFonts w:ascii="Times New Roman" w:hAnsi="Times New Roman" w:cs="Times New Roman"/>
                 <w:sz w:val="19"/>
               </w:rPr>
-              <w:t>331 passed locally; the team-confirmed 56 C++ passes are reported separately above.</w:t>
+              <w:t xml:space="preserve">387 passed in one run: 56 C++ and 331 Java.</w:t>
             </w:r>
           </w:p>
         </w:tc>
@@ -8556,7 +8478,7 @@
         <w:rPr>
           <w:rFonts w:ascii="Times New Roman" w:hAnsi="Times New Roman" w:cs="Times New Roman"/>
         </w:rPr>
-        <w:t>The current-source ExperimentHarness reproduced all E1–E10 aggregates using Windows 11, LLVM-MinGW Clang 23.1.3/C++17 and Temurin 17.0.20.1. The team reported 56 C++ passes with g++ 13.2.0 MinGW-W64 and Temurin 21.0.12.1. This local C++ test launch was inconclusive; Java suites ran separately.</w:t>
+        <w:t xml:space="preserve">The same run reproduced all E1–E10 aggregates. A second laptop with Windows 11, LLVM-MinGW Clang 23.1.3/C++17 and Temurin 17.0.20.1 also reproduced them and passed the 331 Java assertions. The C++ conformance launch was inconclusive on that laptop, so its Java suites ran separately.</w:t>
       </w:r>
     </w:p>
     <w:p>
@@ -9116,14 +9038,7 @@
         <w:rPr>
           <w:rFonts w:ascii="Times New Roman" w:hAnsi="Times New Roman" w:cs="Times New Roman"/>
         </w:rPr>
-        <w:t xml:space="preserve">The 80 trace cases repeat the seeded conditions, not new statistical samples. Counts from different check sets are not pooled. A current-source console run passed 82 checks with two 15-second monitors and 750 ms/three-retry clients. </w:t>
-      </w:r>
-      <w:r>
-        <w:rPr>
-          <w:rFonts w:ascii="Times New Roman" w:hAnsi="Times New Roman" w:cs="Times New Roman"/>
-        </w:rPr>
-        <w:lastRenderedPageBreak/>
-        <w:t>JVM heap limits resolved an initial local memory-allocation failure; both attempts are preserved. This verifies loopback execution, not a timed human presentation or physical LAN.</w:t>
+        <w:t xml:space="preserve">The 80 trace cases repeat the seeded conditions, not new statistical samples. Counts from different check sets are not pooled. A current-source console run passed 82 checks with two 15-second monitors and 750 ms/three-retry clients. JVM heap limits resolved an initial local memory-allocation failure. This verifies loopback execution, not a timed human presentation or physical LAN.</w:t>
       </w:r>
     </w:p>
     <w:p>
@@ -9257,7 +9172,7 @@
         <w:rPr>
           <w:rFonts w:ascii="Times New Roman" w:hAnsi="Times New Roman" w:cs="Times New Roman"/>
         </w:rPr>
-        <w:t>The separate-computer demonstration remains unverified. LAN addressing, firewalls and a timed four-member rehearsal require the actual laptops. The team-confirmed C++ conformance result and the local execution scope are distinguished in Section 6.4.</w:t>
+        <w:t xml:space="preserve">The separate-computer demonstration remains unverified. LAN addressing, firewalls and a timed four-member rehearsal require the actual laptops. Section 6.4 states which laptop ran each suite.</w:t>
       </w:r>
     </w:p>
     <w:p>
@@ -9338,33 +9253,46 @@
         <w:rPr>
           <w:rFonts w:ascii="Times New Roman" w:hAnsi="Times New Roman" w:cs="Times New Roman"/>
         </w:rPr>
-        <w:t>[2] RFC Editor. XDR External Data Representation Standard. RFC 4506, Sections 4.10–4.11. https://www.rfc-editor.org/rfc/rfc4506.html</w:t>
-      </w:r>
-    </w:p>
-    <w:p>
-      <w:pPr>
-        <w:rPr>
-          <w:rFonts w:ascii="Times New Roman" w:hAnsi="Times New Roman" w:cs="Times New Roman"/>
-        </w:rPr>
-      </w:pPr>
-      <w:r>
-        <w:rPr>
-          <w:rFonts w:ascii="Times New Roman" w:hAnsi="Times New Roman" w:cs="Times New Roman"/>
-        </w:rPr>
-        <w:t>[3] RFC Editor. UDP Usage Guidelines. RFC 8085, Section 3.3. https://www.rfc-editor.org/rfc/rfc8085.html</w:t>
-      </w:r>
-    </w:p>
-    <w:p>
-      <w:pPr>
-        <w:rPr>
-          <w:rFonts w:ascii="Times New Roman" w:hAnsi="Times New Roman" w:cs="Times New Roman"/>
-        </w:rPr>
-      </w:pPr>
-      <w:r>
-        <w:rPr>
-          <w:rFonts w:ascii="Times New Roman" w:hAnsi="Times New Roman" w:cs="Times New Roman"/>
-        </w:rPr>
-        <w:t>[4] RFC Editor. RPC Remote Procedure Call Protocol Specification Version 2. RFC 5531, Section 5. https://www.rfc-editor.org/rfc/rfc5531.html</w:t>
+        <w:t xml:space="preserve">[2] M. Eisler, Ed. XDR: External Data Representation Standard. RFC 4506, Sections 4.10–4.11. https://www.rfc-editor.org/rfc/rfc4506.html</w:t>
+      </w:r>
+    </w:p>
+    <w:p>
+      <w:pPr>
+        <w:rPr>
+          <w:rFonts w:ascii="Times New Roman" w:hAnsi="Times New Roman" w:cs="Times New Roman"/>
+        </w:rPr>
+      </w:pPr>
+      <w:r>
+        <w:rPr>
+          <w:rFonts w:ascii="Times New Roman" w:hAnsi="Times New Roman" w:cs="Times New Roman"/>
+        </w:rPr>
+        <w:t xml:space="preserve">[3] L. Eggert, G. Fairhurst and G. Shepherd. UDP Usage Guidelines. RFC 8085, Section 3.3. https://www.rfc-editor.org/rfc/rfc8085.html</w:t>
+      </w:r>
+    </w:p>
+    <w:p>
+      <w:pPr>
+        <w:rPr>
+          <w:rFonts w:ascii="Times New Roman" w:hAnsi="Times New Roman" w:cs="Times New Roman"/>
+        </w:rPr>
+      </w:pPr>
+      <w:r>
+        <w:rPr>
+          <w:rFonts w:ascii="Times New Roman" w:hAnsi="Times New Roman" w:cs="Times New Roman"/>
+        </w:rPr>
+        <w:t xml:space="preserve">[4] R. Thurlow. RPC: Remote Procedure Call Protocol Specification Version 2. RFC 5531, Section 5. https://www.rfc-editor.org/rfc/rfc5531.html</w:t>
+      </w:r>
+    </w:p>
+    <w:p>
+      <w:pPr>
+        <w:rPr>
+          <w:rFonts w:ascii="Times New Roman" w:hAnsi="Times New Roman" w:cs="Times New Roman"/>
+        </w:rPr>
+      </w:pPr>
+      <w:r>
+        <w:rPr>
+          <w:rFonts w:ascii="Times New Roman" w:hAnsi="Times New Roman" w:cs="Times New Roman"/>
+        </w:rPr>
+        <w:t xml:space="preserve">[5] SC6103 Distributed Systems. Lecture notes 2, Interprocess Communication: Request-Reply Message Structure, slide 71. 2026–2027 Trimester 1.</w:t>
       </w:r>
     </w:p>
     <w:p>
@@ -10021,7 +9949,7 @@
                 <w:rFonts w:ascii="Times New Roman" w:hAnsi="Times New Roman" w:cs="Times New Roman"/>
                 <w:sz w:val="19"/>
               </w:rPr>
-              <w:t>Section 2, Tables 1–3: manual scalar/string codecs over byte arrays. Table 7 records 56 team-confirmed C++ and 222 local Java conformance passes.</w:t>
+              <w:t xml:space="preserve">Section 2, Tables 1–3: manual scalar/string codecs over byte arrays. Table 7 records 56 C++ and 222 Java conformance passes.</w:t>
             </w:r>
           </w:p>
         </w:tc>
@@ -11553,13 +11481,7 @@
         <w:rPr>
           <w:rFonts w:ascii="Times New Roman" w:hAnsi="Times New Roman" w:cs="Times New Roman"/>
         </w:rPr>
-        <w:t>Source package: SC6103-project-source.zip</w:t>
-      </w:r>
-      <w:r>
-        <w:rPr>
-          <w:rFonts w:ascii="Times New Roman" w:hAnsi="Times New Roman" w:cs="Times New Roman"/>
-        </w:rPr>
-        <w:t>. Commit: 5d448daefc0bd03d3bfc047efb825d4c00953cc2. Current-source verification: 11 October 2026. Program files are unchanged; paths below are relative to the extracted package root.</w:t>
+        <w:t xml:space="preserve">Source package: SC6103-project-source.zip. Program source: commit 5d448daefc0bd03d3bfc047efb825d4c00953cc2; later commits add only this report and documentation updates. Verified on 11 October 2026 without modifying any program file. Paths below are relative to the extracted package root.</w:t>
       </w:r>
     </w:p>
     <w:p>
@@ -11586,7 +11508,7 @@
         <w:rPr>
           <w:rFonts w:ascii="Times New Roman" w:hAnsi="Times New Roman" w:cs="Times New Roman"/>
         </w:rPr>
-        <w:t>Build and run with scripts/test-all.ps1 -Experiments and a C++17 compiler/JDK 17 or later. The team confirmed 56 C++ passes; the local C++ launch was inconclusive, so the Java suites ran separately as below. The Linux/macOS script was not executed in this verification. A separate extracted-package rebuild succeeded, but Windows application control blocked the newly built server at launch. No fresh-package console rerun is claimed.</w:t>
+        <w:t xml:space="preserve">Build and run with scripts/test-all.ps1 -Experiments and a C++17 compiler/JDK 17 or later. The source at this commit was packaged, extracted to a clean folder and rebuilt on the g++ laptop, where all 387 checks and E1–E10 passed in one run. On the second laptop the C++ launch was inconclusive, so the Java suites ran separately as below. A package rebuild also succeeded there, but Windows application control blocked the newly built server at launch. The Linux/macOS script was not executed.</w:t>
       </w:r>
     </w:p>
     <w:p>

</xml_diff>